<commit_message>
docs: use display name in project documents
</commit_message>
<xml_diff>
--- a/deliverables/project-initiation/01-工业路由器装配MES-项目立项与需求分析书.docx
+++ b/deliverables/project-initiation/01-工业路由器装配MES-项目立项与需求分析书.docx
@@ -231,7 +231,7 @@
                 <w:color w:val="1F2A37"/>
                 <w:sz w:val="20"/>
               </w:rPr>
-              <w:t>李文韬</w:t>
+              <w:t>李先生</w:t>
             </w:r>
           </w:p>
         </w:tc>
@@ -1090,7 +1090,7 @@
                 <w:color w:val="1F2A37"/>
                 <w:sz w:val="19"/>
               </w:rPr>
-              <w:t>李文韬</w:t>
+              <w:t>李先生</w:t>
             </w:r>
           </w:p>
         </w:tc>
@@ -9960,7 +9960,7 @@
         <w:color w:val="5A6672"/>
         <w:sz w:val="18"/>
       </w:rPr>
-      <w:t xml:space="preserve">工业路由器装配 MES 试点候选 | 李文韬 | </w:t>
+      <w:t xml:space="preserve">工业路由器装配 MES 试点候选 | 李先生 | </w:t>
     </w:r>
     <w:r>
       <w:rPr>

</xml_diff>